<commit_message>
feat: redesign learn page, add quiz leaderboard, CMS mod for facts/glossary, and fix social directory/chat
</commit_message>
<xml_diff>
--- a/estudo/relatorio/Secao_Tecnologias_Hexomel_PAP.docx
+++ b/estudo/relatorio/Secao_Tecnologias_Hexomel_PAP.docx
@@ -1351,7 +1351,7 @@
           <w:sz w:val="24"/>
           <w:szCs w:val="24"/>
         </w:rPr>
-        <w:t xml:space="preserve">No projeto Hexomel, o HTML5 está presente em páginas como index.html, shop.html, checkout.html, profile.html e admin.html. Isto mostra que o sistema segue uma abordagem multipágina, em que cada área importante possui a sua própria página.</w:t>
+        <w:t xml:space="preserve">No projeto Hexomel, o HTML5 está presente em páginas como index.html, shop.html, aprender.html, checkout.html, profile.html e admin.html. Isto mostra que o sistema segue uma abordagem multipágina, em que cada área importante possui a sua própria página.</w:t>
       </w:r>
     </w:p>
     <w:p>
@@ -1429,7 +1429,7 @@
           <w:sz w:val="24"/>
           <w:szCs w:val="24"/>
         </w:rPr>
-        <w:t xml:space="preserve">No Hexomel, o CSS é usado em ficheiros como index.css, modern.css, skeleton.css e i18n.css. É graças a esta camada que o site ganha identidade visual premium, loaders, transições e consistência entre a área pública, o perfil e os dashboards.</w:t>
+        <w:t xml:space="preserve">No Hexomel, o CSS é usado em ficheiros como index.css, modern.css, aprender.css, skeleton.css e i18n.css. É graças a esta camada que o site ganha identidade visual, loaders, transições e consistência entre a área pública, o perfil e os dashboards.</w:t>
       </w:r>
     </w:p>
     <w:p>
@@ -1585,7 +1585,7 @@
           <w:sz w:val="24"/>
           <w:szCs w:val="24"/>
         </w:rPr>
-        <w:t xml:space="preserve">No Hexomel, o JavaScript controla autenticação, carrinho, filtros da loja, perfil, dashboards, comunidade, workshops, analytics e checkout. Módulos como main.js, shop.js, auth.js, checkout.js e analytics.js mostram essa divisão de responsabilidades.</w:t>
+        <w:t xml:space="preserve">No Hexomel, o JavaScript controla autenticação, carrinho, filtros da loja, perfil, aprender (quiz e glossário), dashboards, comunidade, workshops, analytics e checkout. Módulos como main.js, shop.js, aprender.js, auth.js, checkout.js e analytics.js mostram essa divisão de responsabilidades.</w:t>
       </w:r>
     </w:p>
     <w:p>

</xml_diff>